<commit_message>
Update CICD learning documentation with platform health connector
</commit_message>
<xml_diff>
--- a/docs/salesforce-cicd-learning-steps.docx
+++ b/docs/salesforce-cicd-learning-steps.docx
@@ -3697,7 +3697,1424 @@
         <w:pStyle w:val="Heading1"/>
       </w:pPr>
       <w:r>
-        <w:t>26. Kesimpulan</w:t>
+        <w:t>26. Salesforce Org Health Monitoring</w:t>
+      </w:r>
+    </w:p>
+    <w:p>
+      <w:r>
+        <w:t>Workflow:</w:t>
+      </w:r>
+    </w:p>
+    <w:p>
+      <w:pPr>
+        <w:pStyle w:val="CodeBlockCICD"/>
+      </w:pPr>
+      <w:r>
+        <w:rPr>
+          <w:rFonts w:ascii="Consolas" w:hAnsi="Consolas" w:eastAsia="Consolas"/>
+          <w:sz w:val="18"/>
+        </w:rPr>
+        <w:t>Salesforce Org Health</w:t>
+      </w:r>
+    </w:p>
+    <w:p>
+      <w:r>
+        <w:t>File:</w:t>
+      </w:r>
+    </w:p>
+    <w:p>
+      <w:pPr>
+        <w:pStyle w:val="CodeBlockCICD"/>
+      </w:pPr>
+      <w:r>
+        <w:rPr>
+          <w:rFonts w:ascii="Consolas" w:hAnsi="Consolas" w:eastAsia="Consolas"/>
+          <w:sz w:val="18"/>
+        </w:rPr>
+        <w:t>.github/workflows/salesforce-org-health.yml</w:t>
+      </w:r>
+    </w:p>
+    <w:p>
+      <w:r>
+        <w:t>Target:</w:t>
+      </w:r>
+    </w:p>
+    <w:p>
+      <w:pPr>
+        <w:pStyle w:val="CodeBlockCICD"/>
+      </w:pPr>
+      <w:r>
+        <w:rPr>
+          <w:rFonts w:ascii="Consolas" w:hAnsi="Consolas" w:eastAsia="Consolas"/>
+          <w:sz w:val="18"/>
+        </w:rPr>
+        <w:t>SF_PROD_AUTH_URL -&gt; dummy prod</w:t>
+      </w:r>
+    </w:p>
+    <w:p>
+      <w:r>
+        <w:t>Tujuan:</w:t>
+      </w:r>
+    </w:p>
+    <w:p>
+      <w:pPr>
+        <w:pStyle w:val="CodeBlockCICD"/>
+      </w:pPr>
+      <w:r>
+        <w:rPr>
+          <w:rFonts w:ascii="Consolas" w:hAnsi="Consolas" w:eastAsia="Consolas"/>
+          <w:sz w:val="18"/>
+        </w:rPr>
+        <w:t>Memberikan laporan health org Salesforce secara terjadwal dan manual.</w:t>
+      </w:r>
+    </w:p>
+    <w:p>
+      <w:r>
+        <w:t>Area yang dicek:</w:t>
+      </w:r>
+    </w:p>
+    <w:p>
+      <w:pPr>
+        <w:pStyle w:val="ListBullet"/>
+        <w:spacing w:after="80"/>
+      </w:pPr>
+      <w:r>
+        <w:t>Org Limits</w:t>
+      </w:r>
+    </w:p>
+    <w:p>
+      <w:pPr>
+        <w:pStyle w:val="ListBullet"/>
+        <w:spacing w:after="80"/>
+      </w:pPr>
+      <w:r>
+        <w:t>Product Health</w:t>
+      </w:r>
+    </w:p>
+    <w:p>
+      <w:pPr>
+        <w:pStyle w:val="ListBullet"/>
+        <w:spacing w:after="80"/>
+      </w:pPr>
+      <w:r>
+        <w:t>Opportunity Health</w:t>
+      </w:r>
+    </w:p>
+    <w:p>
+      <w:pPr>
+        <w:pStyle w:val="ListBullet"/>
+        <w:spacing w:after="80"/>
+      </w:pPr>
+      <w:r>
+        <w:t>Quote Health</w:t>
+      </w:r>
+    </w:p>
+    <w:p>
+      <w:pPr>
+        <w:pStyle w:val="ListBullet"/>
+        <w:spacing w:after="80"/>
+      </w:pPr>
+      <w:r>
+        <w:t>Order Health</w:t>
+      </w:r>
+    </w:p>
+    <w:p>
+      <w:pPr>
+        <w:pStyle w:val="ListBullet"/>
+        <w:spacing w:after="80"/>
+      </w:pPr>
+      <w:r>
+        <w:t>Asset Health</w:t>
+      </w:r>
+    </w:p>
+    <w:p>
+      <w:pPr>
+        <w:pStyle w:val="ListBullet"/>
+        <w:spacing w:after="80"/>
+      </w:pPr>
+      <w:r>
+        <w:t>Field Verification</w:t>
+      </w:r>
+    </w:p>
+    <w:p>
+      <w:r>
+        <w:t>Artifact:</w:t>
+      </w:r>
+    </w:p>
+    <w:p>
+      <w:pPr>
+        <w:pStyle w:val="CodeBlockCICD"/>
+      </w:pPr>
+      <w:r>
+        <w:rPr>
+          <w:rFonts w:ascii="Consolas" w:hAnsi="Consolas" w:eastAsia="Consolas"/>
+          <w:sz w:val="18"/>
+        </w:rPr>
+        <w:t>org-health-report</w:t>
+      </w:r>
+    </w:p>
+    <w:p>
+      <w:r>
+        <w:t>Isi artifact:</w:t>
+      </w:r>
+    </w:p>
+    <w:p>
+      <w:pPr>
+        <w:pStyle w:val="CodeBlockCICD"/>
+      </w:pPr>
+      <w:r>
+        <w:rPr>
+          <w:rFonts w:ascii="Consolas" w:hAnsi="Consolas" w:eastAsia="Consolas"/>
+          <w:sz w:val="18"/>
+        </w:rPr>
+        <w:t>org-health-report.md</w:t>
+      </w:r>
+    </w:p>
+    <w:p>
+      <w:pPr>
+        <w:pStyle w:val="CodeBlockCICD"/>
+      </w:pPr>
+      <w:r>
+        <w:rPr>
+          <w:rFonts w:ascii="Consolas" w:hAnsi="Consolas" w:eastAsia="Consolas"/>
+          <w:sz w:val="18"/>
+        </w:rPr>
+        <w:t>org-limits.json</w:t>
+      </w:r>
+    </w:p>
+    <w:p>
+      <w:pPr>
+        <w:pStyle w:val="CodeBlockCICD"/>
+      </w:pPr>
+      <w:r>
+        <w:rPr>
+          <w:rFonts w:ascii="Consolas" w:hAnsi="Consolas" w:eastAsia="Consolas"/>
+          <w:sz w:val="18"/>
+        </w:rPr>
+        <w:t>org-health-report.xlsx</w:t>
+      </w:r>
+    </w:p>
+    <w:p>
+      <w:r>
+        <w:t>Sheet Excel:</w:t>
+      </w:r>
+    </w:p>
+    <w:p>
+      <w:pPr>
+        <w:pStyle w:val="CodeBlockCICD"/>
+      </w:pPr>
+      <w:r>
+        <w:rPr>
+          <w:rFonts w:ascii="Consolas" w:hAnsi="Consolas" w:eastAsia="Consolas"/>
+          <w:sz w:val="18"/>
+        </w:rPr>
+        <w:t>Summary</w:t>
+      </w:r>
+    </w:p>
+    <w:p>
+      <w:pPr>
+        <w:pStyle w:val="CodeBlockCICD"/>
+      </w:pPr>
+      <w:r>
+        <w:rPr>
+          <w:rFonts w:ascii="Consolas" w:hAnsi="Consolas" w:eastAsia="Consolas"/>
+          <w:sz w:val="18"/>
+        </w:rPr>
+        <w:t>Org Limits</w:t>
+      </w:r>
+    </w:p>
+    <w:p>
+      <w:pPr>
+        <w:pStyle w:val="CodeBlockCICD"/>
+      </w:pPr>
+      <w:r>
+        <w:rPr>
+          <w:rFonts w:ascii="Consolas" w:hAnsi="Consolas" w:eastAsia="Consolas"/>
+          <w:sz w:val="18"/>
+        </w:rPr>
+        <w:t>Health Report</w:t>
+      </w:r>
+    </w:p>
+    <w:p>
+      <w:r>
+        <w:t>Cara menjalankan manual:</w:t>
+      </w:r>
+    </w:p>
+    <w:p>
+      <w:pPr>
+        <w:pStyle w:val="CodeBlockCICD"/>
+      </w:pPr>
+      <w:r>
+        <w:rPr>
+          <w:rFonts w:ascii="Consolas" w:hAnsi="Consolas" w:eastAsia="Consolas"/>
+          <w:sz w:val="18"/>
+        </w:rPr>
+        <w:t>Actions</w:t>
+      </w:r>
+    </w:p>
+    <w:p>
+      <w:pPr>
+        <w:pStyle w:val="CodeBlockCICD"/>
+      </w:pPr>
+      <w:r>
+        <w:rPr>
+          <w:rFonts w:ascii="Consolas" w:hAnsi="Consolas" w:eastAsia="Consolas"/>
+          <w:sz w:val="18"/>
+        </w:rPr>
+        <w:t>Salesforce Org Health</w:t>
+      </w:r>
+    </w:p>
+    <w:p>
+      <w:pPr>
+        <w:pStyle w:val="CodeBlockCICD"/>
+      </w:pPr>
+      <w:r>
+        <w:rPr>
+          <w:rFonts w:ascii="Consolas" w:hAnsi="Consolas" w:eastAsia="Consolas"/>
+          <w:sz w:val="18"/>
+        </w:rPr>
+        <w:t>Run workflow</w:t>
+      </w:r>
+    </w:p>
+    <w:p>
+      <w:pPr>
+        <w:pStyle w:val="CodeBlockCICD"/>
+      </w:pPr>
+      <w:r>
+        <w:rPr>
+          <w:rFonts w:ascii="Consolas" w:hAnsi="Consolas" w:eastAsia="Consolas"/>
+          <w:sz w:val="18"/>
+        </w:rPr>
+        <w:t>Branch: main</w:t>
+      </w:r>
+    </w:p>
+    <w:p>
+      <w:r>
+        <w:t>Cara membaca Org Limits:</w:t>
+      </w:r>
+    </w:p>
+    <w:p>
+      <w:pPr>
+        <w:pStyle w:val="CodeBlockCICD"/>
+      </w:pPr>
+      <w:r>
+        <w:rPr>
+          <w:rFonts w:ascii="Consolas" w:hAnsi="Consolas" w:eastAsia="Consolas"/>
+          <w:sz w:val="18"/>
+        </w:rPr>
+        <w:t>Limit Name  = nama limit Salesforce</w:t>
+      </w:r>
+    </w:p>
+    <w:p>
+      <w:pPr>
+        <w:pStyle w:val="CodeBlockCICD"/>
+      </w:pPr>
+      <w:r>
+        <w:rPr>
+          <w:rFonts w:ascii="Consolas" w:hAnsi="Consolas" w:eastAsia="Consolas"/>
+          <w:sz w:val="18"/>
+        </w:rPr>
+        <w:t>Max         = batas maksimal</w:t>
+      </w:r>
+    </w:p>
+    <w:p>
+      <w:pPr>
+        <w:pStyle w:val="CodeBlockCICD"/>
+      </w:pPr>
+      <w:r>
+        <w:rPr>
+          <w:rFonts w:ascii="Consolas" w:hAnsi="Consolas" w:eastAsia="Consolas"/>
+          <w:sz w:val="18"/>
+        </w:rPr>
+        <w:t>Remaining   = sisa limit</w:t>
+      </w:r>
+    </w:p>
+    <w:p>
+      <w:r>
+        <w:t>Contoh:</w:t>
+      </w:r>
+    </w:p>
+    <w:p>
+      <w:pPr>
+        <w:pStyle w:val="CodeBlockCICD"/>
+      </w:pPr>
+      <w:r>
+        <w:rPr>
+          <w:rFonts w:ascii="Consolas" w:hAnsi="Consolas" w:eastAsia="Consolas"/>
+          <w:sz w:val="18"/>
+        </w:rPr>
+        <w:t>DailyApiRequests</w:t>
+      </w:r>
+    </w:p>
+    <w:p>
+      <w:pPr>
+        <w:pStyle w:val="CodeBlockCICD"/>
+      </w:pPr>
+      <w:r>
+        <w:rPr>
+          <w:rFonts w:ascii="Consolas" w:hAnsi="Consolas" w:eastAsia="Consolas"/>
+          <w:sz w:val="18"/>
+        </w:rPr>
+        <w:t>Max: 15000</w:t>
+      </w:r>
+    </w:p>
+    <w:p>
+      <w:pPr>
+        <w:pStyle w:val="CodeBlockCICD"/>
+      </w:pPr>
+      <w:r>
+        <w:rPr>
+          <w:rFonts w:ascii="Consolas" w:hAnsi="Consolas" w:eastAsia="Consolas"/>
+          <w:sz w:val="18"/>
+        </w:rPr>
+        <w:t>Remaining: 14661</w:t>
+      </w:r>
+    </w:p>
+    <w:p>
+      <w:r>
+        <w:t>Artinya API request harian masih tersisa 14.661 dari 15.000.</w:t>
+      </w:r>
+    </w:p>
+    <w:p>
+      <w:pPr>
+        <w:pStyle w:val="Heading1"/>
+      </w:pPr>
+      <w:r>
+        <w:t>27. Salesforce Platform Health Connector</w:t>
+      </w:r>
+    </w:p>
+    <w:p>
+      <w:r>
+        <w:t>Workflow:</w:t>
+      </w:r>
+    </w:p>
+    <w:p>
+      <w:pPr>
+        <w:pStyle w:val="CodeBlockCICD"/>
+      </w:pPr>
+      <w:r>
+        <w:rPr>
+          <w:rFonts w:ascii="Consolas" w:hAnsi="Consolas" w:eastAsia="Consolas"/>
+          <w:sz w:val="18"/>
+        </w:rPr>
+        <w:t>Salesforce Platform Health Connector</w:t>
+      </w:r>
+    </w:p>
+    <w:p>
+      <w:r>
+        <w:t>File:</w:t>
+      </w:r>
+    </w:p>
+    <w:p>
+      <w:pPr>
+        <w:pStyle w:val="CodeBlockCICD"/>
+      </w:pPr>
+      <w:r>
+        <w:rPr>
+          <w:rFonts w:ascii="Consolas" w:hAnsi="Consolas" w:eastAsia="Consolas"/>
+          <w:sz w:val="18"/>
+        </w:rPr>
+        <w:t>.github/workflows/salesforce-platform-health.yml</w:t>
+      </w:r>
+    </w:p>
+    <w:p>
+      <w:pPr>
+        <w:pStyle w:val="CodeBlockCICD"/>
+      </w:pPr>
+      <w:r>
+        <w:rPr>
+          <w:rFonts w:ascii="Consolas" w:hAnsi="Consolas" w:eastAsia="Consolas"/>
+          <w:sz w:val="18"/>
+        </w:rPr>
+        <w:t>scripts/create_platform_health_excel_report.py</w:t>
+      </w:r>
+    </w:p>
+    <w:p>
+      <w:r>
+        <w:t>Target:</w:t>
+      </w:r>
+    </w:p>
+    <w:p>
+      <w:pPr>
+        <w:pStyle w:val="CodeBlockCICD"/>
+      </w:pPr>
+      <w:r>
+        <w:rPr>
+          <w:rFonts w:ascii="Consolas" w:hAnsi="Consolas" w:eastAsia="Consolas"/>
+          <w:sz w:val="18"/>
+        </w:rPr>
+        <w:t>SF_PROD_AUTH_URL -&gt; dummy prod</w:t>
+      </w:r>
+    </w:p>
+    <w:p>
+      <w:r>
+        <w:t>Jadwal:</w:t>
+      </w:r>
+    </w:p>
+    <w:p>
+      <w:pPr>
+        <w:pStyle w:val="CodeBlockCICD"/>
+      </w:pPr>
+      <w:r>
+        <w:rPr>
+          <w:rFonts w:ascii="Consolas" w:hAnsi="Consolas" w:eastAsia="Consolas"/>
+          <w:sz w:val="18"/>
+        </w:rPr>
+        <w:t>Setiap hari jam 01:00 WIB</w:t>
+      </w:r>
+    </w:p>
+    <w:p>
+      <w:r>
+        <w:t>Cron GitHub:</w:t>
+      </w:r>
+    </w:p>
+    <w:p>
+      <w:pPr>
+        <w:pStyle w:val="CodeBlockCICD"/>
+      </w:pPr>
+      <w:r>
+        <w:rPr>
+          <w:rFonts w:ascii="Consolas" w:hAnsi="Consolas" w:eastAsia="Consolas"/>
+          <w:sz w:val="18"/>
+        </w:rPr>
+        <w:t>schedule:</w:t>
+      </w:r>
+    </w:p>
+    <w:p>
+      <w:pPr>
+        <w:pStyle w:val="CodeBlockCICD"/>
+      </w:pPr>
+      <w:r>
+        <w:rPr>
+          <w:rFonts w:ascii="Consolas" w:hAnsi="Consolas" w:eastAsia="Consolas"/>
+          <w:sz w:val="18"/>
+        </w:rPr>
+        <w:t xml:space="preserve">  - cron: "0 18 * * *"</w:t>
+      </w:r>
+    </w:p>
+    <w:p>
+      <w:r>
+        <w:t>Catatan:</w:t>
+      </w:r>
+    </w:p>
+    <w:p>
+      <w:pPr>
+        <w:pStyle w:val="CodeBlockCICD"/>
+      </w:pPr>
+      <w:r>
+        <w:rPr>
+          <w:rFonts w:ascii="Consolas" w:hAnsi="Consolas" w:eastAsia="Consolas"/>
+          <w:sz w:val="18"/>
+        </w:rPr>
+        <w:t>GitHub Actions memakai UTC.</w:t>
+      </w:r>
+    </w:p>
+    <w:p>
+      <w:pPr>
+        <w:pStyle w:val="CodeBlockCICD"/>
+      </w:pPr>
+      <w:r>
+        <w:rPr>
+          <w:rFonts w:ascii="Consolas" w:hAnsi="Consolas" w:eastAsia="Consolas"/>
+          <w:sz w:val="18"/>
+        </w:rPr>
+        <w:t>01:00 WIB = 18:00 UTC hari sebelumnya.</w:t>
+      </w:r>
+    </w:p>
+    <w:p>
+      <w:r>
+        <w:t>Tujuan connector:</w:t>
+      </w:r>
+    </w:p>
+    <w:p>
+      <w:pPr>
+        <w:pStyle w:val="CodeBlockCICD"/>
+      </w:pPr>
+      <w:r>
+        <w:rPr>
+          <w:rFonts w:ascii="Consolas" w:hAnsi="Consolas" w:eastAsia="Consolas"/>
+          <w:sz w:val="18"/>
+        </w:rPr>
+        <w:t>Observe Salesforce platform health &amp; performance secara terjadwal.</w:t>
+      </w:r>
+    </w:p>
+    <w:p>
+      <w:r>
+        <w:t>Area yang dicek:</w:t>
+      </w:r>
+    </w:p>
+    <w:p>
+      <w:pPr>
+        <w:pStyle w:val="ListBullet"/>
+        <w:spacing w:after="80"/>
+      </w:pPr>
+      <w:r>
+        <w:t>Org limits</w:t>
+      </w:r>
+    </w:p>
+    <w:p>
+      <w:pPr>
+        <w:pStyle w:val="ListBullet"/>
+        <w:spacing w:after="80"/>
+      </w:pPr>
+      <w:r>
+        <w:t>API usage / remaining limit</w:t>
+      </w:r>
+    </w:p>
+    <w:p>
+      <w:pPr>
+        <w:pStyle w:val="ListBullet"/>
+        <w:spacing w:after="80"/>
+      </w:pPr>
+      <w:r>
+        <w:t>Async Apex failures</w:t>
+      </w:r>
+    </w:p>
+    <w:p>
+      <w:pPr>
+        <w:pStyle w:val="ListBullet"/>
+        <w:spacing w:after="80"/>
+      </w:pPr>
+      <w:r>
+        <w:t>Apex test failures</w:t>
+      </w:r>
+    </w:p>
+    <w:p>
+      <w:pPr>
+        <w:pStyle w:val="ListBullet"/>
+        <w:spacing w:after="80"/>
+      </w:pPr>
+      <w:r>
+        <w:t>Login failures</w:t>
+      </w:r>
+    </w:p>
+    <w:p>
+      <w:pPr>
+        <w:pStyle w:val="ListBullet"/>
+        <w:spacing w:after="80"/>
+      </w:pPr>
+      <w:r>
+        <w:t>Product missing code</w:t>
+      </w:r>
+    </w:p>
+    <w:p>
+      <w:pPr>
+        <w:pStyle w:val="ListBullet"/>
+        <w:spacing w:after="80"/>
+      </w:pPr>
+      <w:r>
+        <w:t>Open Opportunity lewat CloseDate</w:t>
+      </w:r>
+    </w:p>
+    <w:p>
+      <w:pPr>
+        <w:pStyle w:val="ListBullet"/>
+        <w:spacing w:after="80"/>
+      </w:pPr>
+      <w:r>
+        <w:t>Recommendations</w:t>
+      </w:r>
+    </w:p>
+    <w:p>
+      <w:r>
+        <w:t>Artifact:</w:t>
+      </w:r>
+    </w:p>
+    <w:p>
+      <w:pPr>
+        <w:pStyle w:val="CodeBlockCICD"/>
+      </w:pPr>
+      <w:r>
+        <w:rPr>
+          <w:rFonts w:ascii="Consolas" w:hAnsi="Consolas" w:eastAsia="Consolas"/>
+          <w:sz w:val="18"/>
+        </w:rPr>
+        <w:t>platform-health-report</w:t>
+      </w:r>
+    </w:p>
+    <w:p>
+      <w:r>
+        <w:t>Isi artifact:</w:t>
+      </w:r>
+    </w:p>
+    <w:p>
+      <w:pPr>
+        <w:pStyle w:val="CodeBlockCICD"/>
+      </w:pPr>
+      <w:r>
+        <w:rPr>
+          <w:rFonts w:ascii="Consolas" w:hAnsi="Consolas" w:eastAsia="Consolas"/>
+          <w:sz w:val="18"/>
+        </w:rPr>
+        <w:t>platform-health-report.md</w:t>
+      </w:r>
+    </w:p>
+    <w:p>
+      <w:pPr>
+        <w:pStyle w:val="CodeBlockCICD"/>
+      </w:pPr>
+      <w:r>
+        <w:rPr>
+          <w:rFonts w:ascii="Consolas" w:hAnsi="Consolas" w:eastAsia="Consolas"/>
+          <w:sz w:val="18"/>
+        </w:rPr>
+        <w:t>platform-health-report.xlsx</w:t>
+      </w:r>
+    </w:p>
+    <w:p>
+      <w:pPr>
+        <w:pStyle w:val="CodeBlockCICD"/>
+      </w:pPr>
+      <w:r>
+        <w:rPr>
+          <w:rFonts w:ascii="Consolas" w:hAnsi="Consolas" w:eastAsia="Consolas"/>
+          <w:sz w:val="18"/>
+        </w:rPr>
+        <w:t>org-limits.json</w:t>
+      </w:r>
+    </w:p>
+    <w:p>
+      <w:pPr>
+        <w:pStyle w:val="CodeBlockCICD"/>
+      </w:pPr>
+      <w:r>
+        <w:rPr>
+          <w:rFonts w:ascii="Consolas" w:hAnsi="Consolas" w:eastAsia="Consolas"/>
+          <w:sz w:val="18"/>
+        </w:rPr>
+        <w:t>async-apex-failures.json</w:t>
+      </w:r>
+    </w:p>
+    <w:p>
+      <w:pPr>
+        <w:pStyle w:val="CodeBlockCICD"/>
+      </w:pPr>
+      <w:r>
+        <w:rPr>
+          <w:rFonts w:ascii="Consolas" w:hAnsi="Consolas" w:eastAsia="Consolas"/>
+          <w:sz w:val="18"/>
+        </w:rPr>
+        <w:t>apex-test-failures.json</w:t>
+      </w:r>
+    </w:p>
+    <w:p>
+      <w:pPr>
+        <w:pStyle w:val="CodeBlockCICD"/>
+      </w:pPr>
+      <w:r>
+        <w:rPr>
+          <w:rFonts w:ascii="Consolas" w:hAnsi="Consolas" w:eastAsia="Consolas"/>
+          <w:sz w:val="18"/>
+        </w:rPr>
+        <w:t>login-failures.json</w:t>
+      </w:r>
+    </w:p>
+    <w:p>
+      <w:pPr>
+        <w:pStyle w:val="CodeBlockCICD"/>
+      </w:pPr>
+      <w:r>
+        <w:rPr>
+          <w:rFonts w:ascii="Consolas" w:hAnsi="Consolas" w:eastAsia="Consolas"/>
+          <w:sz w:val="18"/>
+        </w:rPr>
+        <w:t>products-missing-code.json</w:t>
+      </w:r>
+    </w:p>
+    <w:p>
+      <w:pPr>
+        <w:pStyle w:val="CodeBlockCICD"/>
+      </w:pPr>
+      <w:r>
+        <w:rPr>
+          <w:rFonts w:ascii="Consolas" w:hAnsi="Consolas" w:eastAsia="Consolas"/>
+          <w:sz w:val="18"/>
+        </w:rPr>
+        <w:t>opportunities-past-close.json</w:t>
+      </w:r>
+    </w:p>
+    <w:p>
+      <w:r>
+        <w:t>Sheet Excel:</w:t>
+      </w:r>
+    </w:p>
+    <w:p>
+      <w:pPr>
+        <w:pStyle w:val="CodeBlockCICD"/>
+      </w:pPr>
+      <w:r>
+        <w:rPr>
+          <w:rFonts w:ascii="Consolas" w:hAnsi="Consolas" w:eastAsia="Consolas"/>
+          <w:sz w:val="18"/>
+        </w:rPr>
+        <w:t>Summary</w:t>
+      </w:r>
+    </w:p>
+    <w:p>
+      <w:pPr>
+        <w:pStyle w:val="CodeBlockCICD"/>
+      </w:pPr>
+      <w:r>
+        <w:rPr>
+          <w:rFonts w:ascii="Consolas" w:hAnsi="Consolas" w:eastAsia="Consolas"/>
+          <w:sz w:val="18"/>
+        </w:rPr>
+        <w:t>Org Limits</w:t>
+      </w:r>
+    </w:p>
+    <w:p>
+      <w:pPr>
+        <w:pStyle w:val="CodeBlockCICD"/>
+      </w:pPr>
+      <w:r>
+        <w:rPr>
+          <w:rFonts w:ascii="Consolas" w:hAnsi="Consolas" w:eastAsia="Consolas"/>
+          <w:sz w:val="18"/>
+        </w:rPr>
+        <w:t>Async Apex Failures</w:t>
+      </w:r>
+    </w:p>
+    <w:p>
+      <w:pPr>
+        <w:pStyle w:val="CodeBlockCICD"/>
+      </w:pPr>
+      <w:r>
+        <w:rPr>
+          <w:rFonts w:ascii="Consolas" w:hAnsi="Consolas" w:eastAsia="Consolas"/>
+          <w:sz w:val="18"/>
+        </w:rPr>
+        <w:t>Apex Test Failures</w:t>
+      </w:r>
+    </w:p>
+    <w:p>
+      <w:pPr>
+        <w:pStyle w:val="CodeBlockCICD"/>
+      </w:pPr>
+      <w:r>
+        <w:rPr>
+          <w:rFonts w:ascii="Consolas" w:hAnsi="Consolas" w:eastAsia="Consolas"/>
+          <w:sz w:val="18"/>
+        </w:rPr>
+        <w:t>Login Failures</w:t>
+      </w:r>
+    </w:p>
+    <w:p>
+      <w:pPr>
+        <w:pStyle w:val="CodeBlockCICD"/>
+      </w:pPr>
+      <w:r>
+        <w:rPr>
+          <w:rFonts w:ascii="Consolas" w:hAnsi="Consolas" w:eastAsia="Consolas"/>
+          <w:sz w:val="18"/>
+        </w:rPr>
+        <w:t>Data Quality</w:t>
+      </w:r>
+    </w:p>
+    <w:p>
+      <w:pPr>
+        <w:pStyle w:val="CodeBlockCICD"/>
+      </w:pPr>
+      <w:r>
+        <w:rPr>
+          <w:rFonts w:ascii="Consolas" w:hAnsi="Consolas" w:eastAsia="Consolas"/>
+          <w:sz w:val="18"/>
+        </w:rPr>
+        <w:t>Recommendations</w:t>
+      </w:r>
+    </w:p>
+    <w:p>
+      <w:r>
+        <w:t>Cara menjalankan manual:</w:t>
+      </w:r>
+    </w:p>
+    <w:p>
+      <w:pPr>
+        <w:pStyle w:val="CodeBlockCICD"/>
+      </w:pPr>
+      <w:r>
+        <w:rPr>
+          <w:rFonts w:ascii="Consolas" w:hAnsi="Consolas" w:eastAsia="Consolas"/>
+          <w:sz w:val="18"/>
+        </w:rPr>
+        <w:t>Actions</w:t>
+      </w:r>
+    </w:p>
+    <w:p>
+      <w:pPr>
+        <w:pStyle w:val="CodeBlockCICD"/>
+      </w:pPr>
+      <w:r>
+        <w:rPr>
+          <w:rFonts w:ascii="Consolas" w:hAnsi="Consolas" w:eastAsia="Consolas"/>
+          <w:sz w:val="18"/>
+        </w:rPr>
+        <w:t>Salesforce Platform Health Connector</w:t>
+      </w:r>
+    </w:p>
+    <w:p>
+      <w:pPr>
+        <w:pStyle w:val="CodeBlockCICD"/>
+      </w:pPr>
+      <w:r>
+        <w:rPr>
+          <w:rFonts w:ascii="Consolas" w:hAnsi="Consolas" w:eastAsia="Consolas"/>
+          <w:sz w:val="18"/>
+        </w:rPr>
+        <w:t>Run workflow</w:t>
+      </w:r>
+    </w:p>
+    <w:p>
+      <w:pPr>
+        <w:pStyle w:val="CodeBlockCICD"/>
+      </w:pPr>
+      <w:r>
+        <w:rPr>
+          <w:rFonts w:ascii="Consolas" w:hAnsi="Consolas" w:eastAsia="Consolas"/>
+          <w:sz w:val="18"/>
+        </w:rPr>
+        <w:t>Branch: main</w:t>
+      </w:r>
+    </w:p>
+    <w:p>
+      <w:r>
+        <w:t>Cara membaca status:</w:t>
+      </w:r>
+    </w:p>
+    <w:p>
+      <w:pPr>
+        <w:pStyle w:val="CodeBlockCICD"/>
+      </w:pPr>
+      <w:r>
+        <w:rPr>
+          <w:rFonts w:ascii="Consolas" w:hAnsi="Consolas" w:eastAsia="Consolas"/>
+          <w:sz w:val="18"/>
+        </w:rPr>
+        <w:t>GREEN  = tidak ada critical issue</w:t>
+      </w:r>
+    </w:p>
+    <w:p>
+      <w:pPr>
+        <w:pStyle w:val="CodeBlockCICD"/>
+      </w:pPr>
+      <w:r>
+        <w:rPr>
+          <w:rFonts w:ascii="Consolas" w:hAnsi="Consolas" w:eastAsia="Consolas"/>
+          <w:sz w:val="18"/>
+        </w:rPr>
+        <w:t>YELLOW = ada warning data quality atau login failure</w:t>
+      </w:r>
+    </w:p>
+    <w:p>
+      <w:pPr>
+        <w:pStyle w:val="CodeBlockCICD"/>
+      </w:pPr>
+      <w:r>
+        <w:rPr>
+          <w:rFonts w:ascii="Consolas" w:hAnsi="Consolas" w:eastAsia="Consolas"/>
+          <w:sz w:val="18"/>
+        </w:rPr>
+        <w:t>RED    = ada critical issue seperti Apex failure atau test failure</w:t>
+      </w:r>
+    </w:p>
+    <w:p>
+      <w:r>
+        <w:t>Contoh issue yang perlu diperhatikan:</w:t>
+      </w:r>
+    </w:p>
+    <w:p>
+      <w:pPr>
+        <w:pStyle w:val="CodeBlockCICD"/>
+      </w:pPr>
+      <w:r>
+        <w:rPr>
+          <w:rFonts w:ascii="Consolas" w:hAnsi="Consolas" w:eastAsia="Consolas"/>
+          <w:sz w:val="18"/>
+        </w:rPr>
+        <w:t>DailyApiRequests remaining rendah</w:t>
+      </w:r>
+    </w:p>
+    <w:p>
+      <w:pPr>
+        <w:pStyle w:val="CodeBlockCICD"/>
+      </w:pPr>
+      <w:r>
+        <w:rPr>
+          <w:rFonts w:ascii="Consolas" w:hAnsi="Consolas" w:eastAsia="Consolas"/>
+          <w:sz w:val="18"/>
+        </w:rPr>
+        <w:t>Async Apex job failed</w:t>
+      </w:r>
+    </w:p>
+    <w:p>
+      <w:pPr>
+        <w:pStyle w:val="CodeBlockCICD"/>
+      </w:pPr>
+      <w:r>
+        <w:rPr>
+          <w:rFonts w:ascii="Consolas" w:hAnsi="Consolas" w:eastAsia="Consolas"/>
+          <w:sz w:val="18"/>
+        </w:rPr>
+        <w:t>Apex test failure</w:t>
+      </w:r>
+    </w:p>
+    <w:p>
+      <w:pPr>
+        <w:pStyle w:val="CodeBlockCICD"/>
+      </w:pPr>
+      <w:r>
+        <w:rPr>
+          <w:rFonts w:ascii="Consolas" w:hAnsi="Consolas" w:eastAsia="Consolas"/>
+          <w:sz w:val="18"/>
+        </w:rPr>
+        <w:t>Failed login meningkat</w:t>
+      </w:r>
+    </w:p>
+    <w:p>
+      <w:pPr>
+        <w:pStyle w:val="CodeBlockCICD"/>
+      </w:pPr>
+      <w:r>
+        <w:rPr>
+          <w:rFonts w:ascii="Consolas" w:hAnsi="Consolas" w:eastAsia="Consolas"/>
+          <w:sz w:val="18"/>
+        </w:rPr>
+        <w:t>Product aktif tanpa ProductCode</w:t>
+      </w:r>
+    </w:p>
+    <w:p>
+      <w:pPr>
+        <w:pStyle w:val="CodeBlockCICD"/>
+      </w:pPr>
+      <w:r>
+        <w:rPr>
+          <w:rFonts w:ascii="Consolas" w:hAnsi="Consolas" w:eastAsia="Consolas"/>
+          <w:sz w:val="18"/>
+        </w:rPr>
+        <w:t>Opportunity masih open tapi CloseDate sudah lewat</w:t>
+      </w:r>
+    </w:p>
+    <w:p>
+      <w:pPr>
+        <w:pStyle w:val="Heading1"/>
+      </w:pPr>
+      <w:r>
+        <w:t>28. Mapping ke Observability dan Backup Recovery</w:t>
+      </w:r>
+    </w:p>
+    <w:p>
+      <w:r>
+        <w:t>Solusi yang sudah dibuat bisa dipakai sebagai MVP connector untuk:</w:t>
+      </w:r>
+    </w:p>
+    <w:p>
+      <w:pPr>
+        <w:pStyle w:val="CodeBlockCICD"/>
+      </w:pPr>
+      <w:r>
+        <w:rPr>
+          <w:rFonts w:ascii="Consolas" w:hAnsi="Consolas" w:eastAsia="Consolas"/>
+          <w:sz w:val="18"/>
+        </w:rPr>
+        <w:t>Test konektor Salesforce buat observe platform health &amp; performance.</w:t>
+      </w:r>
+    </w:p>
+    <w:p>
+      <w:r>
+        <w:t>Alur connector:</w:t>
+      </w:r>
+    </w:p>
+    <w:p>
+      <w:pPr>
+        <w:pStyle w:val="CodeBlockCICD"/>
+      </w:pPr>
+      <w:r>
+        <w:rPr>
+          <w:rFonts w:ascii="Consolas" w:hAnsi="Consolas" w:eastAsia="Consolas"/>
+          <w:sz w:val="18"/>
+        </w:rPr>
+        <w:t>GitHub Actions Scheduler</w:t>
+      </w:r>
+    </w:p>
+    <w:p>
+      <w:pPr>
+        <w:pStyle w:val="CodeBlockCICD"/>
+      </w:pPr>
+      <w:r>
+        <w:rPr>
+          <w:rFonts w:ascii="Consolas" w:hAnsi="Consolas" w:eastAsia="Consolas"/>
+          <w:sz w:val="18"/>
+        </w:rPr>
+        <w:t>-&gt; Salesforce CLI</w:t>
+      </w:r>
+    </w:p>
+    <w:p>
+      <w:pPr>
+        <w:pStyle w:val="CodeBlockCICD"/>
+      </w:pPr>
+      <w:r>
+        <w:rPr>
+          <w:rFonts w:ascii="Consolas" w:hAnsi="Consolas" w:eastAsia="Consolas"/>
+          <w:sz w:val="18"/>
+        </w:rPr>
+        <w:t>-&gt; SF_PROD_AUTH_URL</w:t>
+      </w:r>
+    </w:p>
+    <w:p>
+      <w:pPr>
+        <w:pStyle w:val="CodeBlockCICD"/>
+      </w:pPr>
+      <w:r>
+        <w:rPr>
+          <w:rFonts w:ascii="Consolas" w:hAnsi="Consolas" w:eastAsia="Consolas"/>
+          <w:sz w:val="18"/>
+        </w:rPr>
+        <w:t>-&gt; Query health/performance signals</w:t>
+      </w:r>
+    </w:p>
+    <w:p>
+      <w:pPr>
+        <w:pStyle w:val="CodeBlockCICD"/>
+      </w:pPr>
+      <w:r>
+        <w:rPr>
+          <w:rFonts w:ascii="Consolas" w:hAnsi="Consolas" w:eastAsia="Consolas"/>
+          <w:sz w:val="18"/>
+        </w:rPr>
+        <w:t>-&gt; Generate Markdown, JSON, dan Excel report</w:t>
+      </w:r>
+    </w:p>
+    <w:p>
+      <w:pPr>
+        <w:pStyle w:val="CodeBlockCICD"/>
+      </w:pPr>
+      <w:r>
+        <w:rPr>
+          <w:rFonts w:ascii="Consolas" w:hAnsi="Consolas" w:eastAsia="Consolas"/>
+          <w:sz w:val="18"/>
+        </w:rPr>
+        <w:t>-&gt; Upload artifact sebagai evidence</w:t>
+      </w:r>
+    </w:p>
+    <w:p>
+      <w:r>
+        <w:t>Mapping ke kebutuhan observability:</w:t>
+      </w:r>
+    </w:p>
+    <w:p>
+      <w:pPr>
+        <w:pStyle w:val="CodeBlockCICD"/>
+      </w:pPr>
+      <w:r>
+        <w:rPr>
+          <w:rFonts w:ascii="Consolas" w:hAnsi="Consolas" w:eastAsia="Consolas"/>
+          <w:sz w:val="18"/>
+        </w:rPr>
+        <w:t>API limit monitoring        -&gt; Org Limits</w:t>
+      </w:r>
+    </w:p>
+    <w:p>
+      <w:pPr>
+        <w:pStyle w:val="CodeBlockCICD"/>
+      </w:pPr>
+      <w:r>
+        <w:rPr>
+          <w:rFonts w:ascii="Consolas" w:hAnsi="Consolas" w:eastAsia="Consolas"/>
+          <w:sz w:val="18"/>
+        </w:rPr>
+        <w:t>Apex performance/failure    -&gt; Async Apex Failures</w:t>
+      </w:r>
+    </w:p>
+    <w:p>
+      <w:pPr>
+        <w:pStyle w:val="CodeBlockCICD"/>
+      </w:pPr>
+      <w:r>
+        <w:rPr>
+          <w:rFonts w:ascii="Consolas" w:hAnsi="Consolas" w:eastAsia="Consolas"/>
+          <w:sz w:val="18"/>
+        </w:rPr>
+        <w:t>Testing health              -&gt; Apex Test Failures</w:t>
+      </w:r>
+    </w:p>
+    <w:p>
+      <w:pPr>
+        <w:pStyle w:val="CodeBlockCICD"/>
+      </w:pPr>
+      <w:r>
+        <w:rPr>
+          <w:rFonts w:ascii="Consolas" w:hAnsi="Consolas" w:eastAsia="Consolas"/>
+          <w:sz w:val="18"/>
+        </w:rPr>
+        <w:t>Security signal             -&gt; Login Failures</w:t>
+      </w:r>
+    </w:p>
+    <w:p>
+      <w:pPr>
+        <w:pStyle w:val="CodeBlockCICD"/>
+      </w:pPr>
+      <w:r>
+        <w:rPr>
+          <w:rFonts w:ascii="Consolas" w:hAnsi="Consolas" w:eastAsia="Consolas"/>
+          <w:sz w:val="18"/>
+        </w:rPr>
+        <w:t>Data quality                -&gt; Product dan Opportunity checks</w:t>
+      </w:r>
+    </w:p>
+    <w:p>
+      <w:pPr>
+        <w:pStyle w:val="CodeBlockCICD"/>
+      </w:pPr>
+      <w:r>
+        <w:rPr>
+          <w:rFonts w:ascii="Consolas" w:hAnsi="Consolas" w:eastAsia="Consolas"/>
+          <w:sz w:val="18"/>
+        </w:rPr>
+        <w:t>Audit evidence              -&gt; Excel, Markdown, JSON artifacts</w:t>
+      </w:r>
+    </w:p>
+    <w:p>
+      <w:pPr>
+        <w:pStyle w:val="CodeBlockCICD"/>
+      </w:pPr>
+      <w:r>
+        <w:rPr>
+          <w:rFonts w:ascii="Consolas" w:hAnsi="Consolas" w:eastAsia="Consolas"/>
+          <w:sz w:val="18"/>
+        </w:rPr>
+        <w:t>Scheduled monitoring        -&gt; Daily 01:00 WIB</w:t>
+      </w:r>
+    </w:p>
+    <w:p>
+      <w:r>
+        <w:t>Mapping ke Backup &amp; Recovery Maturity:</w:t>
+      </w:r>
+    </w:p>
+    <w:p>
+      <w:pPr>
+        <w:pStyle w:val="CodeBlockCICD"/>
+      </w:pPr>
+      <w:r>
+        <w:rPr>
+          <w:rFonts w:ascii="Consolas" w:hAnsi="Consolas" w:eastAsia="Consolas"/>
+          <w:sz w:val="18"/>
+        </w:rPr>
+        <w:t>Backup metadata             -&gt; Salesforce Metadata Backup</w:t>
+      </w:r>
+    </w:p>
+    <w:p>
+      <w:pPr>
+        <w:pStyle w:val="CodeBlockCICD"/>
+      </w:pPr>
+      <w:r>
+        <w:rPr>
+          <w:rFonts w:ascii="Consolas" w:hAnsi="Consolas" w:eastAsia="Consolas"/>
+          <w:sz w:val="18"/>
+        </w:rPr>
+        <w:t>Backup data                 -&gt; Salesforce Data Backup</w:t>
+      </w:r>
+    </w:p>
+    <w:p>
+      <w:pPr>
+        <w:pStyle w:val="CodeBlockCICD"/>
+      </w:pPr>
+      <w:r>
+        <w:rPr>
+          <w:rFonts w:ascii="Consolas" w:hAnsi="Consolas" w:eastAsia="Consolas"/>
+          <w:sz w:val="18"/>
+        </w:rPr>
+        <w:t>Pre-deploy validation       -&gt; Salesforce Validate</w:t>
+      </w:r>
+    </w:p>
+    <w:p>
+      <w:pPr>
+        <w:pStyle w:val="CodeBlockCICD"/>
+      </w:pPr>
+      <w:r>
+        <w:rPr>
+          <w:rFonts w:ascii="Consolas" w:hAnsi="Consolas" w:eastAsia="Consolas"/>
+          <w:sz w:val="18"/>
+        </w:rPr>
+        <w:t>Controlled deployment       -&gt; Salesforce Manual Deploy</w:t>
+      </w:r>
+    </w:p>
+    <w:p>
+      <w:pPr>
+        <w:pStyle w:val="CodeBlockCICD"/>
+      </w:pPr>
+      <w:r>
+        <w:rPr>
+          <w:rFonts w:ascii="Consolas" w:hAnsi="Consolas" w:eastAsia="Consolas"/>
+          <w:sz w:val="18"/>
+        </w:rPr>
+        <w:t>Deploy evidence             -&gt; deploy-report.xlsx</w:t>
+      </w:r>
+    </w:p>
+    <w:p>
+      <w:pPr>
+        <w:pStyle w:val="CodeBlockCICD"/>
+      </w:pPr>
+      <w:r>
+        <w:rPr>
+          <w:rFonts w:ascii="Consolas" w:hAnsi="Consolas" w:eastAsia="Consolas"/>
+          <w:sz w:val="18"/>
+        </w:rPr>
+        <w:t>Health monitoring           -&gt; Org Health dan Platform Health Connector</w:t>
+      </w:r>
+    </w:p>
+    <w:p>
+      <w:pPr>
+        <w:pStyle w:val="CodeBlockCICD"/>
+      </w:pPr>
+      <w:r>
+        <w:rPr>
+          <w:rFonts w:ascii="Consolas" w:hAnsi="Consolas" w:eastAsia="Consolas"/>
+          <w:sz w:val="18"/>
+        </w:rPr>
+        <w:t>Rollback metadata           -&gt; Salesforce Manual Rollback</w:t>
+      </w:r>
+    </w:p>
+    <w:p>
+      <w:pPr>
+        <w:pStyle w:val="CodeBlockCICD"/>
+      </w:pPr>
+      <w:r>
+        <w:rPr>
+          <w:rFonts w:ascii="Consolas" w:hAnsi="Consolas" w:eastAsia="Consolas"/>
+          <w:sz w:val="18"/>
+        </w:rPr>
+        <w:t>Data restore                -&gt; Salesforce Manual Data Restore</w:t>
+      </w:r>
+    </w:p>
+    <w:p>
+      <w:pPr>
+        <w:pStyle w:val="CodeBlockCICD"/>
+      </w:pPr>
+      <w:r>
+        <w:rPr>
+          <w:rFonts w:ascii="Consolas" w:hAnsi="Consolas" w:eastAsia="Consolas"/>
+          <w:sz w:val="18"/>
+        </w:rPr>
+        <w:t>RPO/RTO simulation          -&gt; deploy, verify, rollback, restore drill</w:t>
+      </w:r>
+    </w:p>
+    <w:p>
+      <w:pPr>
+        <w:pStyle w:val="Heading1"/>
+      </w:pPr>
+      <w:r>
+        <w:t>29. Production Enhancement Ideas</w:t>
+      </w:r>
+    </w:p>
+    <w:p>
+      <w:r>
+        <w:t>Untuk production sungguhan, solusi ini bisa diperkuat dengan:</w:t>
+      </w:r>
+    </w:p>
+    <w:p>
+      <w:pPr>
+        <w:pStyle w:val="ListBullet"/>
+        <w:spacing w:after="80"/>
+      </w:pPr>
+      <w:r>
+        <w:t>Private repository</w:t>
+      </w:r>
+    </w:p>
+    <w:p>
+      <w:pPr>
+        <w:pStyle w:val="ListBullet"/>
+        <w:spacing w:after="80"/>
+      </w:pPr>
+      <w:r>
+        <w:t>Dedicated Salesforce integration user</w:t>
+      </w:r>
+    </w:p>
+    <w:p>
+      <w:pPr>
+        <w:pStyle w:val="ListBullet"/>
+        <w:spacing w:after="80"/>
+      </w:pPr>
+      <w:r>
+        <w:t>Secret rotation policy</w:t>
+      </w:r>
+    </w:p>
+    <w:p>
+      <w:pPr>
+        <w:pStyle w:val="ListBullet"/>
+        <w:spacing w:after="80"/>
+      </w:pPr>
+      <w:r>
+        <w:t>Approval sebelum deploy production</w:t>
+      </w:r>
+    </w:p>
+    <w:p>
+      <w:pPr>
+        <w:pStyle w:val="ListBullet"/>
+        <w:spacing w:after="80"/>
+      </w:pPr>
+      <w:r>
+        <w:t>Alert ke Slack, Email, atau Microsoft Teams</w:t>
+      </w:r>
+    </w:p>
+    <w:p>
+      <w:pPr>
+        <w:pStyle w:val="ListBullet"/>
+        <w:spacing w:after="80"/>
+      </w:pPr>
+      <w:r>
+        <w:t>Retention policy untuk artifact backup dan report</w:t>
+      </w:r>
+    </w:p>
+    <w:p>
+      <w:pPr>
+        <w:pStyle w:val="ListBullet"/>
+        <w:spacing w:after="80"/>
+      </w:pPr>
+      <w:r>
+        <w:t>Backup data ke secure storage</w:t>
+      </w:r>
+    </w:p>
+    <w:p>
+      <w:pPr>
+        <w:pStyle w:val="ListBullet"/>
+        <w:spacing w:after="80"/>
+      </w:pPr>
+      <w:r>
+        <w:t>Multi-org monitoring</w:t>
+      </w:r>
+    </w:p>
+    <w:p>
+      <w:pPr>
+        <w:pStyle w:val="ListBullet"/>
+        <w:spacing w:after="80"/>
+      </w:pPr>
+      <w:r>
+        <w:t>Event Monitoring integration</w:t>
+      </w:r>
+    </w:p>
+    <w:p>
+      <w:pPr>
+        <w:pStyle w:val="ListBullet"/>
+        <w:spacing w:after="80"/>
+      </w:pPr>
+      <w:r>
+        <w:t>Threshold RED/YELLOW/GREEN yang disepakati bisnis</w:t>
+      </w:r>
+    </w:p>
+    <w:p>
+      <w:pPr>
+        <w:pStyle w:val="ListBullet"/>
+        <w:spacing w:after="80"/>
+      </w:pPr>
+      <w:r>
+        <w:t>Recovery drill berkala untuk menguji RPO dan RTO</w:t>
+      </w:r>
+    </w:p>
+    <w:p>
+      <w:pPr>
+        <w:pStyle w:val="Heading1"/>
+      </w:pPr>
+      <w:r>
+        <w:t>30. Kesimpulan</w:t>
       </w:r>
     </w:p>
     <w:p>
@@ -3811,6 +5228,30 @@
           <w:sz w:val="18"/>
         </w:rPr>
         <w:t>-&gt; Verify prod</w:t>
+      </w:r>
+    </w:p>
+    <w:p>
+      <w:pPr>
+        <w:pStyle w:val="CodeBlockCICD"/>
+      </w:pPr>
+      <w:r>
+        <w:rPr>
+          <w:rFonts w:ascii="Consolas" w:hAnsi="Consolas" w:eastAsia="Consolas"/>
+          <w:sz w:val="18"/>
+        </w:rPr>
+        <w:t>-&gt; Org Health Monitoring</w:t>
+      </w:r>
+    </w:p>
+    <w:p>
+      <w:pPr>
+        <w:pStyle w:val="CodeBlockCICD"/>
+      </w:pPr>
+      <w:r>
+        <w:rPr>
+          <w:rFonts w:ascii="Consolas" w:hAnsi="Consolas" w:eastAsia="Consolas"/>
+          <w:sz w:val="18"/>
+        </w:rPr>
+        <w:t>-&gt; Platform Health Connector</w:t>
       </w:r>
     </w:p>
     <w:p>

</xml_diff>